<commit_message>
g&g archive march 31
</commit_message>
<xml_diff>
--- a/GandG_YPS_DataLost/Document/CCN Product Proposed for YPS Data Lost.docx
+++ b/GandG_YPS_DataLost/Document/CCN Product Proposed for YPS Data Lost.docx
@@ -284,10 +284,20 @@
         <w:spacing w:before="0" w:beforeAutospacing="0" w:after="0" w:afterAutospacing="0" w:line="360" w:lineRule="auto"/>
       </w:pPr>
       <w:r>
+        <w:rPr>
+          <w:b/>
+          <w:bCs/>
+        </w:rPr>
         <w:t>Each time a YPS transaction reaches the system:</w:t>
       </w:r>
       <w:r>
+        <w:rPr>
+          <w:b/>
+          <w:bCs/>
+        </w:rPr>
         <w:br/>
+      </w:r>
+      <w:r>
         <w:t>a. Check whether a record already exists using the unique key (</w:t>
       </w:r>
       <w:proofErr w:type="spellStart"/>

</xml_diff>